<commit_message>
fix(audit): 审计 backlog 收口（实现层）
P0：
- gomarl_mixer：移除 consensus_score ×10.0 饱和根因，改 [0,10] 截断；ONNX 均匀兜底 neural_used=False（诚信红线）
- 交付包补漏：国创赛路演 PPT 归位、docx 6 处旧品牌泄漏就地修、源码 zip 重打(10-06)、提交清单重写、快照换新版
- submission/ 纳入 brand_scan 扫描面 + 身份定性短语令牌（命中 0）
- 新增 .github/workflows/verify-structural.yml 接线 6 verify + brand + calibration
- user_store_baseline_probe.json 基线补 delete_user，verify_user_store_split ALL PASS

P1：
- 三免登录公开页去 408 叙事，口径统一「11 节点 LangGraph + 7 子 Agent」
- teacher.py 演示指标改环境开关(ENABLE_SIMULATED_TEACHER_METRICS)，neural_mixer 诚实标 trained/neural_used=False
- AGENTS.md 数字口径收口（collected=1380 / 53.31% / 门禁 50）
- 门禁假绿清理：caliber_check 显式「仅告警不阻断」、run_gates 跳过态标「未生效」、check_coverage_thresholds 反斜杠归一
- brand_scan 身份令牌扩展
- openapi.json 快照随 teacher.py 端点变更重生成（契约漂移门禁）

P2：
- 商业计划书归位 02_配套文档
- 5 个废弃原型 HTML 归档 deliverables/design-prototypes-archive
- install_hooks 幂等重装

验证：brand_scan / scan_stale_calibration / 6 verify_* / ruff / OpenAPI 契约 全 PASS（测试层见后续提交）
</commit_message>
<xml_diff>
--- a/submission/02_配套文档/作品详细介绍-芒得很职.docx
+++ b/submission/02_配套文档/作品详细介绍-芒得很职.docx
@@ -12,7 +12,7 @@
           <w:color w:val="1F4E79"/>
           <w:sz w:val="44"/>
         </w:rPr>
-        <w:t>MARS-408 · 考研多智能体个性化学习系统</w:t>
+        <w:t>芒得很职 · 个性化学习多智能体系统</w:t>
       </w:r>
     </w:p>
     <w:p>
@@ -24,7 +24,7 @@
           <w:color w:val="808080"/>
           <w:sz w:val="24"/>
         </w:rPr>
-        <w:t>2026 福建高校"火山杯" Agent 创新大赛 · 参赛作品详细介绍</w:t>
+        <w:t>2026 福建高校"国创赛" Agent 创新大赛 · 参赛作品详细介绍</w:t>
       </w:r>
     </w:p>
     <w:p/>
@@ -46,7 +46,7 @@
           <w:b w:val="0"/>
           <w:sz w:val="22"/>
         </w:rPr>
-        <w:t>MARS-408 是一套基于 LangGraph 多智能体协同架构、借鉴 FrugalRAG 思路的检索增强管线、借鉴 GOMARL 架构的加权共识门的 408 考研个性化学习多智能体系统。系统以"多智能体协同 + 个性化资源生成 + 动态学习路径规划 + 幻觉防控"为核心技术体系，为考研学生提供从画像构建、资源生成、路径规划到效果评估的全链路个性化学习服务。</w:t>
+        <w:t>芒得很职 是一套基于 LangGraph 多智能体协同架构、借鉴 FrugalRAG 思路的检索增强管线、借鉴 GOMARL 架构的加权共识门的 个性化学习多智能体系统。系统以"多智能体协同 + 个性化资源生成 + 动态学习路径规划 + 幻觉防控"为核心技术体系，为学习者提供从画像构建、资源生成、路径规划到效果评估的全链路个性化学习服务。</w:t>
       </w:r>
     </w:p>
     <w:p>
@@ -55,7 +55,7 @@
           <w:b w:val="0"/>
           <w:sz w:val="22"/>
         </w:rPr>
-        <w:t>408 计算机考研每年考生超百万，长期面临三大困境：资料海量、无人诊断薄弱点、刷题与讲解割裂——"学没学会、错在哪、下一步学什么"全靠个人感觉。传统 AI 助手只能一问一答，无法完成"诊断—规划—讲解—练习—复盘"的学习闭环。MARS-408 由 10 个各司其职的 AI Agent（教师讲解、学情诊断、出题组卷、答疑纠错、学习规划等）协同工作，针对每位学生的知识图谱与薄弱点，自动生成个性化学习路径与专属练习，让 AI 从"回答问题的工具"升级为"真正懂你的学习教练"。</w:t>
+        <w:t>408 计算机考研每年考生超百万，长期面临三大困境：资料海量、无人诊断薄弱点、刷题与讲解割裂——"学没学会、错在哪、下一步学什么"全靠个人感觉。传统 AI 助手只能一问一答，无法完成"诊断—规划—讲解—练习—复盘"的学习闭环。芒得很职 由 11 个各司其职的 AI Agent（教师讲解、学情诊断、出题组卷、答疑纠错、学习规划等）协同工作，针对每位学生的知识图谱与薄弱点，自动生成个性化学习路径与专属练习，让 AI 从"回答问题的工具"升级为"真正懂你的学习教练"。</w:t>
       </w:r>
     </w:p>
     <w:p>

</xml_diff>